<commit_message>
Finalisation of key and EIDAS compliant cert creation
Now it's possible to create key material and certs via scripts based on template files

Plse see the readme in createKey_stores directory below example dir
</commit_message>
<xml_diff>
--- a/example/createKey_stores/readMe_en.docx
+++ b/example/createKey_stores/readMe_en.docx
@@ -101,7 +101,7 @@
         <w:ind w:left="283"/>
       </w:pPr>
       <w:r>
-        <w:t>The master script processes multiple CNF files / use cases and also builds a consolidated all-seal-certs.pem file.</w:t>
+        <w:t>The master script processes multiple CNF files / use cases and also builds a consolidated all-seal-certs-&lt;hash&gt;.pem file.</w:t>
       </w:r>
     </w:p>
     <w:p>
@@ -536,7 +536,7 @@
         <w:ind w:left="283"/>
       </w:pPr>
       <w:r>
-        <w:t>Generate RS512, PS512, and ES512 keys.</w:t>
+        <w:t>Generate RS256/RS512, PS256/PS512, and ES256/ES512 keys depending on the selected hash length.</w:t>
       </w:r>
     </w:p>
     <w:p>
@@ -546,7 +546,7 @@
         <w:ind w:left="283"/>
       </w:pPr>
       <w:r>
-        <w:t>Generate RS512, PS512, and ES512 CSRs.</w:t>
+        <w:t>Generate RS256/RS512, PS256/PS512, and ES256/ES512 CSRs depending on the selected hash length.</w:t>
       </w:r>
     </w:p>
     <w:p>
@@ -674,6 +674,38 @@
           </w:p>
         </w:tc>
       </w:tr>
+      <w:tr>
+        <w:tc>
+          <w:tcPr>
+            <w:tcW w:type="dxa" w:w="3249"/>
+          </w:tcPr>
+          <w:p>
+            <w:r>
+              <w:t>--hash &lt;256|512&gt;</w:t>
+            </w:r>
+          </w:p>
+        </w:tc>
+        <w:tc>
+          <w:tcPr>
+            <w:tcW w:type="dxa" w:w="3249"/>
+          </w:tcPr>
+          <w:p>
+            <w:r>
+              <w:t>Select hash length for test generation</w:t>
+            </w:r>
+          </w:p>
+        </w:tc>
+        <w:tc>
+          <w:tcPr>
+            <w:tcW w:type="dxa" w:w="3249"/>
+          </w:tcPr>
+          <w:p>
+            <w:r>
+              <w:t>Default: 512</w:t>
+            </w:r>
+          </w:p>
+        </w:tc>
+      </w:tr>
     </w:tbl>
     <w:p>
       <w:pPr>
@@ -768,7 +800,7 @@
         <w:pStyle w:val="CodeBlock"/>
       </w:pPr>
       <w:r>
-        <w:t>01-create-keys-and-csrs.bat --outdir D:\SealRuns\BankA --cnf BankA.cnf</w:t>
+        <w:t>01-create-keys-and-csrs.bat --outdir .\TC2 --cnf TC2.cnf</w:t>
       </w:r>
     </w:p>
     <w:p>
@@ -843,7 +875,7 @@
         <w:ind w:left="283"/>
       </w:pPr>
       <w:r>
-        <w:t>Generate RS512, PS512, and ES512 test certificates.</w:t>
+        <w:t>Generate RS256/RS512, PS256/PS512, and ES256/ES512 test certificates depending on the selected hash length.</w:t>
       </w:r>
     </w:p>
     <w:p>
@@ -972,6 +1004,38 @@
           </w:p>
         </w:tc>
       </w:tr>
+      <w:tr>
+        <w:tc>
+          <w:tcPr>
+            <w:tcW w:type="dxa" w:w="3249"/>
+          </w:tcPr>
+          <w:p>
+            <w:r>
+              <w:t>--hash &lt;256|512&gt;</w:t>
+            </w:r>
+          </w:p>
+        </w:tc>
+        <w:tc>
+          <w:tcPr>
+            <w:tcW w:type="dxa" w:w="3249"/>
+          </w:tcPr>
+          <w:p>
+            <w:r>
+              <w:t>Use the matching hash mode for certificates and stores</w:t>
+            </w:r>
+          </w:p>
+        </w:tc>
+        <w:tc>
+          <w:tcPr>
+            <w:tcW w:type="dxa" w:w="3249"/>
+          </w:tcPr>
+          <w:p>
+            <w:r>
+              <w:t>Must match Script 1. Default: 512</w:t>
+            </w:r>
+          </w:p>
+        </w:tc>
+      </w:tr>
     </w:tbl>
     <w:p>
       <w:pPr>
@@ -988,7 +1052,7 @@
         <w:ind w:left="283"/>
       </w:pPr>
       <w:r>
-        <w:t>…-rs512.crt.pem, …-ps512.crt.pem, …-es512.crt.pem</w:t>
+        <w:t>…-rs256/rs512.crt.pem, …-ps256/ps512.crt.pem, …-es256/es512.crt.pem</w:t>
       </w:r>
     </w:p>
     <w:p>
@@ -998,7 +1062,7 @@
         <w:ind w:left="283"/>
       </w:pPr>
       <w:r>
-        <w:t>…-rs512-eidas-seal-keypair.p12, …-ps512-eidas-seal-keypair.p12, …-es512-eidas-seal-keypair.p12</w:t>
+        <w:t>…-rs256/rs512-eidas-seal-keypair.p12, …-ps256/ps512-eidas-seal-keypair.p12, …-es256/es512-eidas-seal-keypair.p12</w:t>
       </w:r>
     </w:p>
     <w:p>
@@ -1106,7 +1170,7 @@
         <w:pStyle w:val="CodeBlock"/>
       </w:pPr>
       <w:r>
-        <w:t>02-create-certs-and-stores.bat --outdir D:\SealRuns\BankA</w:t>
+        <w:t>02-create-certs-and-stores.bat --outdir .\TC2</w:t>
       </w:r>
     </w:p>
     <w:p>
@@ -1119,38 +1183,22 @@
     </w:p>
     <w:p>
       <w:r>
-        <w:t>The master script</w:t>
+        <w:t>The master script (doCreateALL) processes a freely configurable list of test cases. For each entry it runs CreateKeysAndCSRs and CreateCertsAndStores with the selected hash length and then merges all generated *all-seal-certs-&lt;hash&gt;.pem files into a new all-seal-certs-&lt;hash&gt;.pem in the current directory.</w:t>
       </w:r>
-      <w:r>
-        <w:t xml:space="preserve"> (</w:t>
-      </w:r>
+      <w:r/>
       <w:proofErr w:type="spellStart"/>
-      <w:r>
-        <w:t>doCreateALL</w:t>
-      </w:r>
+      <w:r/>
       <w:proofErr w:type="spellEnd"/>
-      <w:r>
-        <w:t>)</w:t>
-      </w:r>
-      <w:r>
-        <w:t xml:space="preserve"> processes a freely configurable list of test cases. For each entry it runs </w:t>
-      </w:r>
+      <w:r/>
+      <w:r/>
       <w:proofErr w:type="spellStart"/>
-      <w:r>
-        <w:t>CreateKeysAndCSRs</w:t>
-      </w:r>
+      <w:r/>
       <w:proofErr w:type="spellEnd"/>
-      <w:r>
-        <w:t xml:space="preserve"> and </w:t>
-      </w:r>
+      <w:r/>
       <w:proofErr w:type="spellStart"/>
-      <w:r>
-        <w:t>CreateCertsAndStores</w:t>
-      </w:r>
+      <w:r/>
       <w:proofErr w:type="spellEnd"/>
-      <w:r>
-        <w:t xml:space="preserve"> and then merges all generated *all-seal-certs.pem files into a new all-seal-certs.pem in the current directory.</w:t>
-      </w:r>
+      <w:r/>
     </w:p>
     <w:p>
       <w:pPr>
@@ -1263,6 +1311,38 @@
           </w:p>
         </w:tc>
       </w:tr>
+      <w:tr>
+        <w:tc>
+          <w:tcPr>
+            <w:tcW w:type="dxa" w:w="3249"/>
+          </w:tcPr>
+          <w:p>
+            <w:r>
+              <w:t>--hash &lt;256|512&gt;</w:t>
+            </w:r>
+          </w:p>
+        </w:tc>
+        <w:tc>
+          <w:tcPr>
+            <w:tcW w:type="dxa" w:w="3249"/>
+          </w:tcPr>
+          <w:p>
+            <w:r>
+              <w:t>Process only the selected hash-specific test case directories</w:t>
+            </w:r>
+          </w:p>
+        </w:tc>
+        <w:tc>
+          <w:tcPr>
+            <w:tcW w:type="dxa" w:w="3249"/>
+          </w:tcPr>
+          <w:p>
+            <w:r>
+              <w:t>Default: 512</w:t>
+            </w:r>
+          </w:p>
+        </w:tc>
+      </w:tr>
     </w:tbl>
     <w:p>
       <w:pPr>
@@ -1299,7 +1379,7 @@
         <w:ind w:left="283"/>
       </w:pPr>
       <w:r>
-        <w:t>Use the master script for full runs; use --allCertsOnly for quick rebuilds of the aggregate file.</w:t>
+        <w:t>Use the master script for full runs; use --allCertsOnly for quick rebuilds of the hash-specific aggregate file.</w:t>
       </w:r>
     </w:p>
     <w:p>
@@ -1309,7 +1389,7 @@
         <w:ind w:left="283"/>
       </w:pPr>
       <w:r>
-        <w:t>Before using --allCertsOnly, make sure that *all-seal-certs.pem already exist in the test case directories.</w:t>
+        <w:t>Before using --allCertsOnly, make sure that *all-seal-certs-&lt;hash&gt;.pem already exist in the test case directories.</w:t>
       </w:r>
     </w:p>
     <w:p>
@@ -1334,7 +1414,7 @@
         <w:pStyle w:val="CodeBlock"/>
       </w:pPr>
       <w:r>
-        <w:t>00-run-test-cases.bat --allCertsOnly</w:t>
+        <w:t>00-run-test-cases.bat --allCertsOnly --hash 512</w:t>
       </w:r>
     </w:p>
     <w:p>
@@ -1352,40 +1432,24 @@
         <w:ind w:left="283"/>
       </w:pPr>
       <w:r>
-        <w:t xml:space="preserve">Option A – Single case: run </w:t>
+        <w:t>Option A – Single case: run CreateKeysAndCSRs with --outdir, --cnf, and optionally --hash, then run CreateCertsAndStores with the same --outdir and hash.</w:t>
       </w:r>
       <w:proofErr w:type="spellStart"/>
-      <w:r>
-        <w:t>CreateKeysAndCSRs</w:t>
-      </w:r>
+      <w:r/>
       <w:proofErr w:type="spellEnd"/>
-      <w:r>
-        <w:t xml:space="preserve"> with --</w:t>
-      </w:r>
+      <w:r/>
       <w:proofErr w:type="spellStart"/>
-      <w:r>
-        <w:t>outdir</w:t>
-      </w:r>
+      <w:r/>
       <w:proofErr w:type="spellEnd"/>
-      <w:r>
-        <w:t xml:space="preserve"> and --</w:t>
-      </w:r>
+      <w:r/>
       <w:proofErr w:type="spellStart"/>
-      <w:r>
-        <w:t>cnf</w:t>
-      </w:r>
+      <w:r/>
       <w:proofErr w:type="spellEnd"/>
-      <w:r>
-        <w:t xml:space="preserve">, then run </w:t>
-      </w:r>
+      <w:r/>
       <w:proofErr w:type="spellStart"/>
-      <w:r>
-        <w:t>CreateCertsAndStores</w:t>
-      </w:r>
+      <w:r/>
       <w:proofErr w:type="spellEnd"/>
-      <w:r>
-        <w:t xml:space="preserve"> with the same --outdir.</w:t>
-      </w:r>
+      <w:r/>
     </w:p>
     <w:p>
       <w:pPr>
@@ -1404,7 +1468,7 @@
         <w:ind w:left="283"/>
       </w:pPr>
       <w:r>
-        <w:t>Option C – Update aggregate certificates only: use the master script with --allCertsOnly.</w:t>
+        <w:t>Option C – Update aggregate certificates only: use the master script with --allCertsOnly and the required hash.</w:t>
       </w:r>
     </w:p>
     <w:p>
@@ -1428,7 +1492,7 @@
         <w:pStyle w:val="CodeBlock"/>
       </w:pPr>
       <w:r>
-        <w:t>01-create-keys-and-csrs.bat --outdir .\TC3 --cnf TC3.cnf</w:t>
+        <w:t>01-create-keys-and-csrs.bat --outdir .\TC3 --cnf TC3.cnf --hash 512</w:t>
       </w:r>
     </w:p>
     <w:p>
@@ -1436,7 +1500,7 @@
         <w:pStyle w:val="CodeBlock"/>
       </w:pPr>
       <w:r>
-        <w:t>02-create-certs-and-stores.bat --outdir .\TC3</w:t>
+        <w:t>02-create-certs-and-stores.bat --outdir .\TC3 --hash 512</w:t>
       </w:r>
     </w:p>
     <w:p>
@@ -1468,7 +1532,7 @@
         <w:pStyle w:val="CodeBlock"/>
       </w:pPr>
       <w:r>
-        <w:t>00-run-test-cases.bat --allCertsOnly</w:t>
+        <w:t>00-run-test-cases.bat --allCertsOnly --hash 512</w:t>
       </w:r>
     </w:p>
     <w:p>
@@ -1688,7 +1752,7 @@
           </w:tcPr>
           <w:p>
             <w:r>
-              <w:t>&lt;Prefix&gt;-all-seal-certs.pem</w:t>
+              <w:t>&lt;Prefix&gt;-all-seal-certs-&lt;hash&gt;.pem</w:t>
             </w:r>
           </w:p>
         </w:tc>
@@ -1738,7 +1802,7 @@
           </w:tcPr>
           <w:p>
             <w:r>
-              <w:t>all-seal-certs.pem</w:t>
+              <w:t>all-seal-certs-&lt;hash&gt;.pem</w:t>
             </w:r>
           </w:p>
         </w:tc>
@@ -1748,7 +1812,7 @@
           </w:tcPr>
           <w:p>
             <w:r>
-              <w:t>Aggregate file across all test cases</w:t>
+              <w:t>Aggregate file across all test cases for the selected hash length</w:t>
             </w:r>
           </w:p>
         </w:tc>

</xml_diff>